<commit_message>
docs & audit: finalize sanitized academic documents, substantive test suite, and operational EWS stability report
</commit_message>
<xml_diff>
--- a/manuscript/Anonymized_Manuscript_Scopus_Q1.docx
+++ b/manuscript/Anonymized_Manuscript_Scopus_Q1.docx
@@ -121,172 +121,7 @@
           <w:rFonts w:ascii="Times New Roman" w:hAnsi="Times New Roman"/>
           <w:sz w:val="24"/>
         </w:rPr>
-        <w:t>Public policy communication in the algorithmic era faces severe scrutiny when polished digital narratives clash with ground-level physical execution failures. This research investigates the digital crisis surrounding Indonesia's flagship Free Nutritious Meal (</w:t>
-      </w:r>
-      <w:r>
-        <w:rPr>
-          <w:rFonts w:ascii="Times New Roman" w:hAnsi="Times New Roman"/>
-          <w:i/>
-          <w:sz w:val="24"/>
-        </w:rPr>
-        <w:t>Makan Bergizi Gratis</w:t>
-      </w:r>
-      <w:r>
-        <w:rPr>
-          <w:rFonts w:ascii="Times New Roman" w:hAnsi="Times New Roman"/>
-          <w:sz w:val="24"/>
-        </w:rPr>
-        <w:t xml:space="preserve"> / MBG) program on Platform X (formerly Twitter) through an integrated tri-layer computational communication science framework. Bridging Philip Kotler's Marketing 6.0 concept of the </w:t>
-      </w:r>
-      <w:r>
-        <w:rPr>
-          <w:rFonts w:ascii="Times New Roman" w:hAnsi="Times New Roman"/>
-          <w:i/>
-          <w:sz w:val="24"/>
-        </w:rPr>
-        <w:t>Phygital Gap</w:t>
-      </w:r>
-      <w:r>
-        <w:rPr>
-          <w:rFonts w:ascii="Times New Roman" w:hAnsi="Times New Roman"/>
-          <w:sz w:val="24"/>
-        </w:rPr>
-        <w:t xml:space="preserve"> with Coombs' Situational Crisis Communication Theory (SCCT), Clark &amp; Gerrig's </w:t>
-      </w:r>
-      <w:r>
-        <w:rPr>
-          <w:rFonts w:ascii="Times New Roman" w:hAnsi="Times New Roman"/>
-          <w:i/>
-          <w:sz w:val="24"/>
-        </w:rPr>
-        <w:t>Pretense Theory</w:t>
-      </w:r>
-      <w:r>
-        <w:rPr>
-          <w:rFonts w:ascii="Times New Roman" w:hAnsi="Times New Roman"/>
-          <w:sz w:val="24"/>
-        </w:rPr>
-        <w:t xml:space="preserve"> of irony, and Habermas' structural transformation of the digital public sphere, this study audits a verified inference corpus of $N = 5,263 tweets and a dedicated sarcasm validation corpus of N = 3,395$ tweets. Methodologically, the research executes: (1) a fine-tuned transformer language model (indobenchmark/indobert-base-p2) for granular 9-category emotion classification adapted from Plutchik's taxonomy; (2) rule-based algorithmic modeling of binary lexical contradictions and text-emoji semiotic incongruence to capture digital sarcasm; (3) directed Communication Network Analysis (CNA / SNA) via NetworkX and Louvain community detection to measure topological polarization and network modularity; and (4) thematic Aspect-Based Sentiment Analysis (ABSA) across three operational pillars (logistics, budgeting, and nutritional quality). Empirical results demonstrate that public affective response is overwhelmingly dominated by </w:t>
-      </w:r>
-      <w:r>
-        <w:rPr>
-          <w:rFonts w:ascii="Times New Roman" w:hAnsi="Times New Roman"/>
-          <w:b/>
-          <w:sz w:val="24"/>
-        </w:rPr>
-        <w:t>Disgust (56.24%, 2,960 tweets)</w:t>
-      </w:r>
-      <w:r>
-        <w:rPr>
-          <w:rFonts w:ascii="Times New Roman" w:hAnsi="Times New Roman"/>
-          <w:sz w:val="24"/>
-        </w:rPr>
-        <w:t xml:space="preserve">, followed by </w:t>
-      </w:r>
-      <w:r>
-        <w:rPr>
-          <w:rFonts w:ascii="Times New Roman" w:hAnsi="Times New Roman"/>
-          <w:b/>
-          <w:sz w:val="24"/>
-        </w:rPr>
-        <w:t>Trust (20.39%, 1,073 tweets)</w:t>
-      </w:r>
-      <w:r>
-        <w:rPr>
-          <w:rFonts w:ascii="Times New Roman" w:hAnsi="Times New Roman"/>
-          <w:sz w:val="24"/>
-        </w:rPr>
-        <w:t xml:space="preserve">, </w:t>
-      </w:r>
-      <w:r>
-        <w:rPr>
-          <w:rFonts w:ascii="Times New Roman" w:hAnsi="Times New Roman"/>
-          <w:b/>
-          <w:sz w:val="24"/>
-        </w:rPr>
-        <w:t>Neutral (12.33%, 649 tweets)</w:t>
-      </w:r>
-      <w:r>
-        <w:rPr>
-          <w:rFonts w:ascii="Times New Roman" w:hAnsi="Times New Roman"/>
-          <w:sz w:val="24"/>
-        </w:rPr>
-        <w:t xml:space="preserve">, and </w:t>
-      </w:r>
-      <w:r>
-        <w:rPr>
-          <w:rFonts w:ascii="Times New Roman" w:hAnsi="Times New Roman"/>
-          <w:b/>
-          <w:sz w:val="24"/>
-        </w:rPr>
-        <w:t>Anticipation (9.60%, 505 tweets)</w:t>
-      </w:r>
-      <w:r>
-        <w:rPr>
-          <w:rFonts w:ascii="Times New Roman" w:hAnsi="Times New Roman"/>
-          <w:sz w:val="24"/>
-        </w:rPr>
-        <w:t xml:space="preserve">, while Anger, Sadness, Joy, Surprise, and Fear collectively constitute less than 2%. Sarcasm detection validated 315 tweets (9.28%) characterized by sharp binary semantic oppositions pairing superficial praise with nauseated emojis (🤡, 🤮). Topological graph modeling ($|V| = 971$ nodes, $|E| = 666$ unique directed edges) revealed extreme network sparsity (density = 0.0011) and near-zero reciprocity (1.21%), demonstrating a catastrophic failure of deliberative dialogue. Community detection uncovered hyper-fragmentation with a modularity score of </w:t>
-      </w:r>
-      <w:r>
-        <w:rPr>
-          <w:rFonts w:ascii="Times New Roman" w:hAnsi="Times New Roman"/>
-          <w:b/>
-          <w:sz w:val="24"/>
-        </w:rPr>
-        <w:t>$Q = 0.9837$ across 332 isolated clusters</w:t>
-      </w:r>
-      <w:r>
-        <w:rPr>
-          <w:rFonts w:ascii="Times New Roman" w:hAnsi="Times New Roman"/>
-          <w:sz w:val="24"/>
-        </w:rPr>
-        <w:t xml:space="preserve">, where the giant component encompassed only 9.17% of participating nodes. Structural centrality exposed a stark </w:t>
-      </w:r>
-      <w:r>
-        <w:rPr>
-          <w:rFonts w:ascii="Times New Roman" w:hAnsi="Times New Roman"/>
-          <w:i/>
-          <w:sz w:val="24"/>
-        </w:rPr>
-        <w:t>Power Asymmetry</w:t>
-      </w:r>
-      <w:r>
-        <w:rPr>
-          <w:rFonts w:ascii="Times New Roman" w:hAnsi="Times New Roman"/>
-          <w:sz w:val="24"/>
-        </w:rPr>
-        <w:t xml:space="preserve">: while the designated institutional authority figure (@prabowo) exhibited high in-degree (15) but zero out-degree (0), representing an epistemic power vacuum, an artificial intelligence agent (@grok) emerged as the supreme </w:t>
-      </w:r>
-      <w:r>
-        <w:rPr>
-          <w:rFonts w:ascii="Times New Roman" w:hAnsi="Times New Roman"/>
-          <w:i/>
-          <w:sz w:val="24"/>
-        </w:rPr>
-        <w:t>Algorithmic Oracle</w:t>
-      </w:r>
-      <w:r>
-        <w:rPr>
-          <w:rFonts w:ascii="Times New Roman" w:hAnsi="Times New Roman"/>
-          <w:sz w:val="24"/>
-        </w:rPr>
-        <w:t xml:space="preserve"> commanding the highest out-degree (42). Finally, ABSA empirically substantiated the </w:t>
-      </w:r>
-      <w:r>
-        <w:rPr>
-          <w:rFonts w:ascii="Times New Roman" w:hAnsi="Times New Roman"/>
-          <w:i/>
-          <w:sz w:val="24"/>
-        </w:rPr>
-        <w:t>Phygital Gap</w:t>
-      </w:r>
-      <w:r>
-        <w:rPr>
-          <w:rFonts w:ascii="Times New Roman" w:hAnsi="Times New Roman"/>
-          <w:sz w:val="24"/>
-        </w:rPr>
-        <w:t>, demonstrating that public disgust concentrated specifically on operational breakdowns in Logistics (78.91% Disgust), Budgeting (77.01% Disgust), and Nutrition (71.13% Disgust). This study provides a reproducible, open-science framework for computational public relations, proving that in hyper-fragmented digital arenas, algorithmic verifiers supplant silent institutions when public policy experiences physical-digital decoupling.</w:t>
+        <w:t>Public policy communication in the algorithmic era faces severe scrutiny when polished digital narratives clash with ground-level physical execution failures. This research investigates the digital crisis surrounding Indonesia's flagship Free Nutritious Meal (Makan Bergizi Gratis / MBG) program on Platform X (formerly Twitter) through an integrated tri-layer computational communication science framework. Bridging Philip Kotler's Marketing 6.0 concept of the Phygital Gap with Coombs' Situational Crisis Communication Theory (SCCT), Clark &amp; Gerrig's Pretense Theory of irony, and Habermas' structural transformation of the digital public sphere, this study audits a verified inference corpus of $N = 5,263 tweets and a dedicated sarcasm validation corpus of N = 3,395$ tweets. Methodologically, the research executes: (1) a fine-tuned transformer language model (indobenchmark/indobert-base-p2) for granular 9-category emotion classification adapted from Plutchik's taxonomy; (2) rule-based algorithmic modeling of binary lexical contradictions and text-emoji semiotic incongruence to capture digital sarcasm; (3) directed Communication Network Analysis (CNA / SNA) via NetworkX and Louvain community detection to measure topological polarization and network modularity; and (4) thematic Aspect-Based Sentiment Analysis (ABSA) across three operational pillars (logistics, budgeting, and nutritional quality). Empirical results demonstrate that public affective response is overwhelmingly dominated by Disgust (56.24%, 2,960 tweets), followed by Trust (20.39%, 1,073 tweets), Neutral (12.33%, 649 tweets), and Anticipation (9.60%, 505 tweets), while Anger, Sadness, Joy, Surprise, and Fear collectively constitute less than 2%. Sarcasm detection validated 315 tweets (9.28%) characterized by sharp binary semantic oppositions pairing superficial praise with nauseated emojis (🤡, 🤮). Topological graph modeling ($|V| = 971$ nodes, $|E| = 666$ unique directed edges) revealed extreme network sparsity (density = 0.0011) and near-zero reciprocity (1.21%), demonstrating a catastrophic failure of deliberative dialogue. Community detection uncovered hyper-fragmentation with a modularity score of $Q = 0.9837$ across 332 isolated clusters, where the giant component encompassed only 9.17% of participating nodes. Structural centrality exposed a stark Power Asymmetry: while the designated institutional authority figure (@prabowo) exhibited high in-degree (15) but zero out-degree (0), representing an epistemic power vacuum, an artificial intelligence agent (@grok) emerged as the supreme Algorithmic Oracle commanding the highest out-degree (42). Finally, ABSA empirically substantiated the Phygital Gap, demonstrating that public disgust concentrated specifically on operational breakdowns in Logistics (78.91% Disgust), Budgeting (77.01% Disgust), and Nutrition (71.13% Disgust). This study provides a reproducible, open-science framework for computational public relations, proving that in hyper-fragmented digital arenas, algorithmic verifiers supplant silent institutions when public policy experiences physical-digital decoupling.</w:t>
       </w:r>
     </w:p>
     <w:p>
@@ -679,17 +514,9 @@
       <w:r>
         <w:rPr>
           <w:rFonts w:ascii="Times New Roman" w:hAnsi="Times New Roman"/>
-          <w:b/>
-          <w:sz w:val="24"/>
-        </w:rPr>
-        <w:t>Methodological Contribution:</w:t>
-      </w:r>
-      <w:r>
-        <w:rPr>
-          <w:rFonts w:ascii="Times New Roman" w:hAnsi="Times New Roman"/>
-          <w:sz w:val="24"/>
-        </w:rPr>
-        <w:t xml:space="preserve"> We engineer an end-to-end, reproducible computational pipeline coupling macro-topological graph science (directed NetworkX and Louvain community modularity, $Q = 0.9837$), meso-thematic decomposition (3-pillar Aspect-Based Sentiment Analysis), and micro-affective deep learning (a fine-tuned Indonesian bidirectional transformer, indobert-base-p2, for 9 Plutchik-derived emotions and text-emoji semiotic incongruence).</w:t>
+          <w:sz w:val="24"/>
+        </w:rPr>
+        <w:t>Methodological Contribution: We engineer an end-to-end, reproducible computational pipeline coupling macro-topological graph science (directed NetworkX and Louvain community modularity, $Q = 0.9837$), meso-thematic decomposition (3-pillar Aspect-Based Sentiment Analysis), and micro-affective deep learning (a fine-tuned Indonesian bidirectional transformer, indobert-base-p2, for 9 Plutchik-derived emotions and text-emoji semiotic incongruence).</w:t>
       </w:r>
     </w:p>
     <w:p>
@@ -1336,17 +1163,9 @@
       <w:r>
         <w:rPr>
           <w:rFonts w:ascii="Times New Roman" w:hAnsi="Times New Roman"/>
-          <w:b/>
-          <w:sz w:val="24"/>
-        </w:rPr>
-        <w:t>Deduplication:</w:t>
-      </w:r>
-      <w:r>
-        <w:rPr>
-          <w:rFonts w:ascii="Times New Roman" w:hAnsi="Times New Roman"/>
-          <w:sz w:val="24"/>
-        </w:rPr>
-        <w:t xml:space="preserve"> Removing exact duplicate retweets, resulting in a clean corpus of $N = 5,309$ records (data/processed/data_clean.csv), which was subsequently filtered to $N = 5,263$ high-integrity tweets for final inference.</w:t>
+          <w:sz w:val="24"/>
+        </w:rPr>
+        <w:t>Deduplication: Removing exact duplicate retweets, resulting in a clean corpus of $N = 5,309$ records (data/processed/data_clean.csv), which was subsequently filtered to $N = 5,263$ high-integrity tweets for final inference.</w:t>
       </w:r>
     </w:p>
     <w:p>
@@ -1415,17 +1234,9 @@
       <w:r>
         <w:rPr>
           <w:rFonts w:ascii="Times New Roman" w:hAnsi="Times New Roman"/>
-          <w:b/>
-          <w:sz w:val="24"/>
-        </w:rPr>
-        <w:t>Dataset Partitioning:</w:t>
-      </w:r>
-      <w:r>
-        <w:rPr>
-          <w:rFonts w:ascii="Times New Roman" w:hAnsi="Times New Roman"/>
-          <w:sz w:val="24"/>
-        </w:rPr>
-        <w:t xml:space="preserve"> Stratified splitting of annotated data into 80% training set ($N = 4,210$) and 20% independent holdout test set ($n = 1,053$).</w:t>
+          <w:sz w:val="24"/>
+        </w:rPr>
+        <w:t>Dataset Partitioning: Stratified splitting of annotated data into 80% training set ($N = 4,210$) and 20% independent holdout test set ($n = 1,053$).</w:t>
       </w:r>
     </w:p>
     <w:p>
@@ -1586,19 +1397,11 @@
       <w:r>
         <w:rPr>
           <w:rFonts w:ascii="Times New Roman" w:hAnsi="Times New Roman"/>
-          <w:i/>
           <w:sz w:val="24"/>
         </w:rPr>
         <w:t>In-Degree Centrality ($C_{</w:t>
         <w:tab/>
-        <w:t>ext{in}}(v)$):</w:t>
-      </w:r>
-      <w:r>
-        <w:rPr>
-          <w:rFonts w:ascii="Times New Roman" w:hAnsi="Times New Roman"/>
-          <w:sz w:val="24"/>
-        </w:rPr>
-        <w:t xml:space="preserve"> Quantifies prestige and attention received.</w:t>
+        <w:t>ext{in}}(v)$): Quantifies prestige and attention received.</w:t>
       </w:r>
     </w:p>
     <w:p>
@@ -1609,19 +1412,11 @@
       <w:r>
         <w:rPr>
           <w:rFonts w:ascii="Times New Roman" w:hAnsi="Times New Roman"/>
-          <w:i/>
           <w:sz w:val="24"/>
         </w:rPr>
         <w:t>Out-Degree Centrality ($C_{</w:t>
         <w:tab/>
-        <w:t>ext{out}}(v)$):</w:t>
-      </w:r>
-      <w:r>
-        <w:rPr>
-          <w:rFonts w:ascii="Times New Roman" w:hAnsi="Times New Roman"/>
-          <w:sz w:val="24"/>
-        </w:rPr>
-        <w:t xml:space="preserve"> Quantifies active communicative broadcasting.</w:t>
+        <w:t>ext{out}}(v)$): Quantifies active communicative broadcasting.</w:t>
       </w:r>
     </w:p>
     <w:p>
@@ -1632,17 +1427,9 @@
       <w:r>
         <w:rPr>
           <w:rFonts w:ascii="Times New Roman" w:hAnsi="Times New Roman"/>
-          <w:i/>
-          <w:sz w:val="24"/>
-        </w:rPr>
-        <w:t>Betweenness Centrality ($C_B(v)$):</w:t>
-      </w:r>
-      <w:r>
-        <w:rPr>
-          <w:rFonts w:ascii="Times New Roman" w:hAnsi="Times New Roman"/>
-          <w:sz w:val="24"/>
-        </w:rPr>
-        <w:t xml:space="preserve"> Identifies structural brokers bridging otherwise disconnected clusters.</w:t>
+          <w:sz w:val="24"/>
+        </w:rPr>
+        <w:t>Betweenness Centrality ($C_B(v)$): Identifies structural brokers bridging otherwise disconnected clusters.</w:t>
       </w:r>
     </w:p>
     <w:p>
@@ -2324,37 +2111,7 @@
           <w:rFonts w:ascii="Times New Roman" w:hAnsi="Times New Roman"/>
           <w:sz w:val="24"/>
         </w:rPr>
-        <w:t xml:space="preserve">The distribution demonstrates that public opposition to the MBG program is not driven by generalized ideological </w:t>
-      </w:r>
-      <w:r>
-        <w:rPr>
-          <w:rFonts w:ascii="Times New Roman" w:hAnsi="Times New Roman"/>
-          <w:i/>
-          <w:sz w:val="24"/>
-        </w:rPr>
-        <w:t>Anger</w:t>
-      </w:r>
-      <w:r>
-        <w:rPr>
-          <w:rFonts w:ascii="Times New Roman" w:hAnsi="Times New Roman"/>
-          <w:sz w:val="24"/>
-        </w:rPr>
-        <w:t xml:space="preserve"> ($1.05\%$), but by visceral physical </w:t>
-      </w:r>
-      <w:r>
-        <w:rPr>
-          <w:rFonts w:ascii="Times New Roman" w:hAnsi="Times New Roman"/>
-          <w:i/>
-          <w:sz w:val="24"/>
-        </w:rPr>
-        <w:t>Disgust</w:t>
-      </w:r>
-      <w:r>
-        <w:rPr>
-          <w:rFonts w:ascii="Times New Roman" w:hAnsi="Times New Roman"/>
-          <w:sz w:val="24"/>
-        </w:rPr>
-        <w:t xml:space="preserve"> ($56.24\%$).</w:t>
+        <w:t>The distribution demonstrates that public opposition to the MBG program is not driven by generalized ideological Anger ($1.05\%$), but by visceral physical Disgust ($56.24\%$).</w:t>
       </w:r>
     </w:p>
     <w:p>
@@ -2376,22 +2133,7 @@
           <w:rFonts w:ascii="Times New Roman" w:hAnsi="Times New Roman"/>
           <w:sz w:val="24"/>
         </w:rPr>
-        <w:t xml:space="preserve">Analysis of the validated sarcasm corpus ($N = 3,395$) verified that </w:t>
-      </w:r>
-      <w:r>
-        <w:rPr>
-          <w:rFonts w:ascii="Times New Roman" w:hAnsi="Times New Roman"/>
-          <w:b/>
-          <w:sz w:val="24"/>
-        </w:rPr>
-        <w:t>315 tweets (9.28%)</w:t>
-      </w:r>
-      <w:r>
-        <w:rPr>
-          <w:rFonts w:ascii="Times New Roman" w:hAnsi="Times New Roman"/>
-          <w:sz w:val="24"/>
-        </w:rPr>
-        <w:t xml:space="preserve"> operated as explicit sarcasm, while 3,080 tweets (90.72%) operated as literal communication. Within the sarcastic corpus, 181 tweets exhibited acute binary lexical oppositions.</w:t>
+        <w:t>Analysis of the validated sarcasm corpus ($N = 3,395$) verified that 315 tweets (9.28%) operated as explicit sarcasm, while 3,080 tweets (90.72%) operated as literal communication. Within the sarcastic corpus, 181 tweets exhibited acute binary lexical oppositions.</w:t>
       </w:r>
     </w:p>
     <w:p>
@@ -2502,37 +2244,7 @@
           <w:rFonts w:ascii="Times New Roman" w:hAnsi="Times New Roman"/>
           <w:sz w:val="24"/>
         </w:rPr>
-        <w:t xml:space="preserve">| </w:t>
-      </w:r>
-      <w:r>
-        <w:rPr>
-          <w:rFonts w:ascii="Times New Roman" w:hAnsi="Times New Roman"/>
-          <w:b/>
-          <w:sz w:val="24"/>
-        </w:rPr>
-        <w:t>Total Nodes ($|V|$)</w:t>
-      </w:r>
-      <w:r>
-        <w:rPr>
-          <w:rFonts w:ascii="Times New Roman" w:hAnsi="Times New Roman"/>
-          <w:sz w:val="24"/>
-        </w:rPr>
-        <w:t xml:space="preserve"> | </w:t>
-      </w:r>
-      <w:r>
-        <w:rPr>
-          <w:rFonts w:ascii="Times New Roman" w:hAnsi="Times New Roman"/>
-          <w:b/>
-          <w:sz w:val="24"/>
-        </w:rPr>
-        <w:t>971</w:t>
-      </w:r>
-      <w:r>
-        <w:rPr>
-          <w:rFonts w:ascii="Times New Roman" w:hAnsi="Times New Roman"/>
-          <w:sz w:val="24"/>
-        </w:rPr>
-        <w:t xml:space="preserve"> | Individual accounts engaging in MBG communication |</w:t>
+        <w:t>| Total Nodes ($|V|$) | 971 | Individual accounts engaging in MBG communication |</w:t>
       </w:r>
     </w:p>
     <w:p>
@@ -2545,37 +2257,7 @@
           <w:rFonts w:ascii="Times New Roman" w:hAnsi="Times New Roman"/>
           <w:sz w:val="24"/>
         </w:rPr>
-        <w:t xml:space="preserve">| </w:t>
-      </w:r>
-      <w:r>
-        <w:rPr>
-          <w:rFonts w:ascii="Times New Roman" w:hAnsi="Times New Roman"/>
-          <w:b/>
-          <w:sz w:val="24"/>
-        </w:rPr>
-        <w:t>Unique Directed Edges ($|E|$)</w:t>
-      </w:r>
-      <w:r>
-        <w:rPr>
-          <w:rFonts w:ascii="Times New Roman" w:hAnsi="Times New Roman"/>
-          <w:sz w:val="24"/>
-        </w:rPr>
-        <w:t xml:space="preserve"> | </w:t>
-      </w:r>
-      <w:r>
-        <w:rPr>
-          <w:rFonts w:ascii="Times New Roman" w:hAnsi="Times New Roman"/>
-          <w:b/>
-          <w:sz w:val="24"/>
-        </w:rPr>
-        <w:t>666</w:t>
-      </w:r>
-      <w:r>
-        <w:rPr>
-          <w:rFonts w:ascii="Times New Roman" w:hAnsi="Times New Roman"/>
-          <w:sz w:val="24"/>
-        </w:rPr>
-        <w:t xml:space="preserve"> | Distinct directed mention/reply interactions |</w:t>
+        <w:t>| Unique Directed Edges ($|E|$) | 666 | Distinct directed mention/reply interactions |</w:t>
       </w:r>
     </w:p>
     <w:p>
@@ -3163,22 +2845,7 @@
         </w:rPr>
         <w:t>In stark contrast, xAI's conversational agent (@grok) commanded the highest Out-Degree in the entire network ($C_{</w:t>
         <w:tab/>
-        <w:t xml:space="preserve">ext{out}} = 42$). When netizens sought verification regarding meal pricing formulas or poisoning statistics, they tagged @grok to synthesize facts. The artificial intelligence agent thus stepped in as an </w:t>
-      </w:r>
-      <w:r>
-        <w:rPr>
-          <w:rFonts w:ascii="Times New Roman" w:hAnsi="Times New Roman"/>
-          <w:b/>
-          <w:sz w:val="24"/>
-        </w:rPr>
-        <w:t>Algorithmic Oracle</w:t>
-      </w:r>
-      <w:r>
-        <w:rPr>
-          <w:rFonts w:ascii="Times New Roman" w:hAnsi="Times New Roman"/>
-          <w:sz w:val="24"/>
-        </w:rPr>
-        <w:t>, assuming the communicative role abandoned by state public relations.</w:t>
+        <w:t>ext{out}} = 42$). When netizens sought verification regarding meal pricing formulas or poisoning statistics, they tagged @grok to synthesize facts. The artificial intelligence agent thus stepped in as an Algorithmic Oracle, assuming the communicative role abandoned by state public relations.</w:t>
       </w:r>
     </w:p>
     <w:p>
@@ -3576,52 +3243,7 @@
           <w:rFonts w:ascii="Times New Roman" w:hAnsi="Times New Roman"/>
           <w:sz w:val="24"/>
         </w:rPr>
-        <w:t xml:space="preserve">On the balanced binary benchmark for sarcasm detection, the pipeline achieved an overall accuracy of </w:t>
-      </w:r>
-      <w:r>
-        <w:rPr>
-          <w:rFonts w:ascii="Times New Roman" w:hAnsi="Times New Roman"/>
-          <w:b/>
-          <w:sz w:val="24"/>
-        </w:rPr>
-        <w:t>83.00%</w:t>
-      </w:r>
-      <w:r>
-        <w:rPr>
-          <w:rFonts w:ascii="Times New Roman" w:hAnsi="Times New Roman"/>
-          <w:sz w:val="24"/>
-        </w:rPr>
-        <w:t xml:space="preserve"> and a </w:t>
-      </w:r>
-      <w:r>
-        <w:rPr>
-          <w:rFonts w:ascii="Times New Roman" w:hAnsi="Times New Roman"/>
-          <w:b/>
-          <w:sz w:val="24"/>
-        </w:rPr>
-        <w:t>Macro F1 of 0.8122</w:t>
-      </w:r>
-      <w:r>
-        <w:rPr>
-          <w:rFonts w:ascii="Times New Roman" w:hAnsi="Times New Roman"/>
-          <w:sz w:val="24"/>
-        </w:rPr>
-        <w:t xml:space="preserve">. In 9-class modeling, the model prioritized sensitivity to the primary crisis driver, capturing </w:t>
-      </w:r>
-      <w:r>
-        <w:rPr>
-          <w:rFonts w:ascii="Times New Roman" w:hAnsi="Times New Roman"/>
-          <w:b/>
-          <w:sz w:val="24"/>
-        </w:rPr>
-        <w:t>$96.92\%$ of all empirical Disgust instances</w:t>
-      </w:r>
-      <w:r>
-        <w:rPr>
-          <w:rFonts w:ascii="Times New Roman" w:hAnsi="Times New Roman"/>
-          <w:sz w:val="24"/>
-        </w:rPr>
-        <w:t>. Confusion matrix analysis revealed that misclassifications primarily stemmed from linguistic overlap: sarcastic Trust texts were remapped into Disgust due to the model detecting embedded physical complaint lemmas.</w:t>
+        <w:t>On the balanced binary benchmark for sarcasm detection, the pipeline achieved an overall accuracy of 83.00% and a Macro F1 of 0.8122. In 9-class modeling, the model prioritized sensitivity to the primary crisis driver, capturing $96.92\%$ of all empirical Disgust instances. Confusion matrix analysis revealed that misclassifications primarily stemmed from linguistic overlap: sarcastic Trust texts were remapped into Disgust due to the model detecting embedded physical complaint lemmas.</w:t>
       </w:r>
     </w:p>
     <w:p>
@@ -3796,22 +3418,7 @@
           <w:rFonts w:ascii="Times New Roman" w:hAnsi="Times New Roman"/>
           <w:sz w:val="24"/>
         </w:rPr>
-        <w:t xml:space="preserve">Across all three operational aspects, Disgust exceeded $70\%$, peaking at $78.91\% in Logistics and 77.01\%$ in Budget Allocation. This provides empirical proof of the </w:t>
-      </w:r>
-      <w:r>
-        <w:rPr>
-          <w:rFonts w:ascii="Times New Roman" w:hAnsi="Times New Roman"/>
-          <w:i/>
-          <w:sz w:val="24"/>
-        </w:rPr>
-        <w:t>Phygital Gap</w:t>
-      </w:r>
-      <w:r>
-        <w:rPr>
-          <w:rFonts w:ascii="Times New Roman" w:hAnsi="Times New Roman"/>
-          <w:sz w:val="24"/>
-        </w:rPr>
-        <w:t>: negative affect was not an abstract political grievance, but an intense rejection of operational failures in delivery timing, budget misappropriation, and inadequate dietary portion sizes.</w:t>
+        <w:t>Across all three operational aspects, Disgust exceeded $70\%$, peaking at $78.91\% in Logistics and 77.01\%$ in Budget Allocation. This provides empirical proof of the Phygital Gap: negative affect was not an abstract political grievance, but an intense rejection of operational failures in delivery timing, budget misappropriation, and inadequate dietary portion sizes.</w:t>
       </w:r>
     </w:p>
     <w:p>
@@ -3930,37 +3537,7 @@
           <w:rFonts w:ascii="Times New Roman" w:hAnsi="Times New Roman"/>
           <w:sz w:val="24"/>
         </w:rPr>
-        <w:t xml:space="preserve">Habermas (2006) cautioned that internet-mediated public spheres risk communicative anarchism without institutional mediating structures. The topological network metrics of the MBG discourse provide startling empirical support for this warning. A modularity score of </w:t>
-      </w:r>
-      <w:r>
-        <w:rPr>
-          <w:rFonts w:ascii="Times New Roman" w:hAnsi="Times New Roman"/>
-          <w:b/>
-          <w:sz w:val="24"/>
-        </w:rPr>
-        <w:t>$Q = 0.9837$</w:t>
-      </w:r>
-      <w:r>
-        <w:rPr>
-          <w:rFonts w:ascii="Times New Roman" w:hAnsi="Times New Roman"/>
-          <w:sz w:val="24"/>
-        </w:rPr>
-        <w:t xml:space="preserve"> is extraordinarily high in political communication networks, where modularity typically ranges between $0.40 and 0.65$ (Newman, 2006). Rather than dividing into a classic bi-polar structure (e.g., government supporters vs. opposition partisans), the discourse disintegrated into </w:t>
-      </w:r>
-      <w:r>
-        <w:rPr>
-          <w:rFonts w:ascii="Times New Roman" w:hAnsi="Times New Roman"/>
-          <w:b/>
-          <w:sz w:val="24"/>
-        </w:rPr>
-        <w:t>332 isolated communicative islands</w:t>
-      </w:r>
-      <w:r>
-        <w:rPr>
-          <w:rFonts w:ascii="Times New Roman" w:hAnsi="Times New Roman"/>
-          <w:sz w:val="24"/>
-        </w:rPr>
-        <w:t>.</w:t>
+        <w:t>Habermas (2006) cautioned that internet-mediated public spheres risk communicative anarchism without institutional mediating structures. The topological network metrics of the MBG discourse provide startling empirical support for this warning. A modularity score of $Q = 0.9837$ is extraordinarily high in political communication networks, where modularity typically ranges between $0.40 and 0.65$ (Newman, 2006). Rather than dividing into a classic bi-polar structure (e.g., government supporters vs. opposition partisans), the discourse disintegrated into 332 isolated communicative islands.</w:t>
       </w:r>
     </w:p>
     <w:p>
@@ -3973,22 +3550,7 @@
           <w:rFonts w:ascii="Times New Roman" w:hAnsi="Times New Roman"/>
           <w:sz w:val="24"/>
         </w:rPr>
-        <w:t xml:space="preserve">Coupled with a reciprocity rate of only </w:t>
-      </w:r>
-      <w:r>
-        <w:rPr>
-          <w:rFonts w:ascii="Times New Roman" w:hAnsi="Times New Roman"/>
-          <w:b/>
-          <w:sz w:val="24"/>
-        </w:rPr>
-        <w:t>1.21%</w:t>
-      </w:r>
-      <w:r>
-        <w:rPr>
-          <w:rFonts w:ascii="Times New Roman" w:hAnsi="Times New Roman"/>
-          <w:sz w:val="24"/>
-        </w:rPr>
-        <w:t>, this reveals that the digital discourse was functionally dead as a deliberative space. Citizens broadcasted their frustration into localized micro-clusters, while government actors failed to engage in reciprocal dialogue. The giant component captured only $9.17\%$ of nodes, proving that no single narrative could bridge the fragmented silos.</w:t>
+        <w:t>Coupled with a reciprocity rate of only 1.21%, this reveals that the digital discourse was functionally dead as a deliberative space. Citizens broadcasted their frustration into localized micro-clusters, while government actors failed to engage in reciprocal dialogue. The giant component captured only $9.17\%$ of nodes, proving that no single narrative could bridge the fragmented silos.</w:t>
       </w:r>
     </w:p>
     <w:p>
@@ -4077,22 +3639,7 @@
           <w:rFonts w:ascii="Times New Roman" w:hAnsi="Times New Roman"/>
           <w:sz w:val="24"/>
         </w:rPr>
-        <w:t xml:space="preserve">The identification of 315 validated sarcastic tweets ($9.28\%$) and 181 sharp binary contradictions reflects the tactical adaptation of Indonesian digital rhetoric. Facing potential legal consequences under defamation and electronic information laws (UU ITE), citizens weaponized </w:t>
-      </w:r>
-      <w:r>
-        <w:rPr>
-          <w:rFonts w:ascii="Times New Roman" w:hAnsi="Times New Roman"/>
-          <w:i/>
-          <w:sz w:val="24"/>
-        </w:rPr>
-        <w:t>Pretense Theory</w:t>
-      </w:r>
-      <w:r>
-        <w:rPr>
-          <w:rFonts w:ascii="Times New Roman" w:hAnsi="Times New Roman"/>
-          <w:sz w:val="24"/>
-        </w:rPr>
-        <w:t xml:space="preserve"> (Clark &amp; Gerrig, 1984). Netizens praised the program's 'luxury' while attaching emojis indicating nausea (🤮) or foolishness (🤡). This semiotic incongruity served as an effective cloaking mechanism against automated sentiment tracking systems that rely on superficial keyword dictionaries, preserving critical dissent within algorithmic public spheres.</w:t>
+        <w:t>The identification of 315 validated sarcastic tweets ($9.28\%$) and 181 sharp binary contradictions reflects the tactical adaptation of Indonesian digital rhetoric. Facing potential legal consequences under defamation and electronic information laws (UU ITE), citizens weaponized Pretense Theory (Clark &amp; Gerrig, 1984). Netizens praised the program's 'luxury' while attaching emojis indicating nausea (🤮) or foolishness (🤡). This semiotic incongruity served as an effective cloaking mechanism against automated sentiment tracking systems that rely on superficial keyword dictionaries, preserving critical dissent within algorithmic public spheres.</w:t>
       </w:r>
     </w:p>
     <w:p>
@@ -4376,22 +3923,7 @@
           <w:rFonts w:ascii="Times New Roman" w:hAnsi="Times New Roman"/>
           <w:sz w:val="24"/>
         </w:rPr>
-        <w:t xml:space="preserve">2. </w:t>
-      </w:r>
-      <w:r>
-        <w:rPr>
-          <w:rFonts w:ascii="Times New Roman" w:hAnsi="Times New Roman"/>
-          <w:b/>
-          <w:sz w:val="24"/>
-        </w:rPr>
-        <w:t>Class Imbalance in Granular Modeling:</w:t>
-      </w:r>
-      <w:r>
-        <w:rPr>
-          <w:rFonts w:ascii="Times New Roman" w:hAnsi="Times New Roman"/>
-          <w:sz w:val="24"/>
-        </w:rPr>
-        <w:t xml:space="preserve"> Natural class imbalance in crisis data resulted in low Macro F1 scores for minority emotion classes (Fear, Sadness, Joy), despite high Recall on the dominant Disgust class ($96.92\%$).</w:t>
+        <w:t>2. Class Imbalance in Granular Modeling: Natural class imbalance in crisis data resulted in low Macro F1 scores for minority emotion classes (Fear, Sadness, Joy), despite high Recall on the dominant Disgust class ($96.92\%$).</w:t>
       </w:r>
     </w:p>
     <w:p>
@@ -4505,67 +4037,7 @@
           <w:rFonts w:ascii="Times New Roman" w:hAnsi="Times New Roman"/>
           <w:sz w:val="24"/>
         </w:rPr>
-        <w:t xml:space="preserve">This study mapped the digital crisis of Indonesia's Free Nutritious Meal (MBG) program through an integrated tri-layer computational communication architecture. The empirical findings validate that public resistance was fundamentally driven by a </w:t>
-      </w:r>
-      <w:r>
-        <w:rPr>
-          <w:rFonts w:ascii="Times New Roman" w:hAnsi="Times New Roman"/>
-          <w:b/>
-          <w:sz w:val="24"/>
-        </w:rPr>
-        <w:t>Phygital Gap</w:t>
-      </w:r>
-      <w:r>
-        <w:rPr>
-          <w:rFonts w:ascii="Times New Roman" w:hAnsi="Times New Roman"/>
-          <w:sz w:val="24"/>
-        </w:rPr>
-        <w:t xml:space="preserve">—an irreconcilable discrepancy between the state's polished digital narrative and the substandard physical reality of food delivery. IndoBERT modeling revealed an overwhelming predominance of </w:t>
-      </w:r>
-      <w:r>
-        <w:rPr>
-          <w:rFonts w:ascii="Times New Roman" w:hAnsi="Times New Roman"/>
-          <w:b/>
-          <w:sz w:val="24"/>
-        </w:rPr>
-        <w:t>Disgust (56.24%)</w:t>
-      </w:r>
-      <w:r>
-        <w:rPr>
-          <w:rFonts w:ascii="Times New Roman" w:hAnsi="Times New Roman"/>
-          <w:sz w:val="24"/>
-        </w:rPr>
-        <w:t xml:space="preserve">, while sarcasm detection identified sophisticated linguistic pretense weaponizing incongruous emojis against automated surveillance. Topologically, discourse was paralyzed by near-zero reciprocity ($1.21\%$) and severe hyper-fragmentation ($Q = 0.9837$) across 332 isolated clusters. In the face of an institutional </w:t>
-      </w:r>
-      <w:r>
-        <w:rPr>
-          <w:rFonts w:ascii="Times New Roman" w:hAnsi="Times New Roman"/>
-          <w:b/>
-          <w:sz w:val="24"/>
-        </w:rPr>
-        <w:t>Power Vacuum</w:t>
-      </w:r>
-      <w:r>
-        <w:rPr>
-          <w:rFonts w:ascii="Times New Roman" w:hAnsi="Times New Roman"/>
-          <w:sz w:val="24"/>
-        </w:rPr>
-        <w:t xml:space="preserve">, an artificial intelligence bot (@grok) emerged as an </w:t>
-      </w:r>
-      <w:r>
-        <w:rPr>
-          <w:rFonts w:ascii="Times New Roman" w:hAnsi="Times New Roman"/>
-          <w:b/>
-          <w:sz w:val="24"/>
-        </w:rPr>
-        <w:t>Algorithmic Oracle</w:t>
-      </w:r>
-      <w:r>
-        <w:rPr>
-          <w:rFonts w:ascii="Times New Roman" w:hAnsi="Times New Roman"/>
-          <w:sz w:val="24"/>
-        </w:rPr>
-        <w:t>, signaling a historic evolution in digital communication where algorithms adjudicate policy truths when physical delivery fails.</w:t>
+        <w:t>This study mapped the digital crisis of Indonesia's Free Nutritious Meal (MBG) program through an integrated tri-layer computational communication architecture. The empirical findings validate that public resistance was fundamentally driven by a Phygital Gap—an irreconcilable discrepancy between the state's polished digital narrative and the substandard physical reality of food delivery. IndoBERT modeling revealed an overwhelming predominance of Disgust (56.24%), while sarcasm detection identified sophisticated linguistic pretense weaponizing incongruous emojis against automated surveillance. Topologically, discourse was paralyzed by near-zero reciprocity ($1.21\%$) and severe hyper-fragmentation ($Q = 0.9837$) across 332 isolated clusters. In the face of an institutional Power Vacuum, an artificial intelligence bot (@grok) emerged as an Algorithmic Oracle, signaling a historic evolution in digital communication where algorithms adjudicate policy truths when physical delivery fails.</w:t>
       </w:r>
     </w:p>
     <w:p>

</xml_diff>